<commit_message>
updated at Tue Mar 10 11:27:35 IST 2026
</commit_message>
<xml_diff>
--- a/LinearAlgebra_WinterSpring_2026/CourseOutline.docx
+++ b/LinearAlgebra_WinterSpring_2026/CourseOutline.docx
@@ -110,7 +110,73 @@
           <w:szCs w:val="22"/>
           <w:lang w:val="en-GB"/>
         </w:rPr>
-        <w:t>Last updated: Thursday Jan 8, 2026</w:t>
+        <w:t xml:space="preserve">Last updated: </w:t>
+      </w:r>
+      <w:r>
+        <w:rPr>
+          <w:rFonts w:eastAsia="Arial"/>
+          <w:b w:val="0"/>
+          <w:bCs/>
+          <w:sz w:val="22"/>
+          <w:szCs w:val="22"/>
+          <w:lang w:val="en-GB"/>
+        </w:rPr>
+        <w:t>Monday,</w:t>
+      </w:r>
+      <w:r>
+        <w:rPr>
+          <w:rFonts w:eastAsia="Arial"/>
+          <w:b w:val="0"/>
+          <w:bCs/>
+          <w:sz w:val="22"/>
+          <w:szCs w:val="22"/>
+          <w:lang w:val="en-GB"/>
+        </w:rPr>
+        <w:t xml:space="preserve"> </w:t>
+      </w:r>
+      <w:r>
+        <w:rPr>
+          <w:rFonts w:eastAsia="Arial"/>
+          <w:b w:val="0"/>
+          <w:bCs/>
+          <w:sz w:val="22"/>
+          <w:szCs w:val="22"/>
+          <w:lang w:val="en-GB"/>
+        </w:rPr>
+        <w:t>March</w:t>
+      </w:r>
+      <w:r>
+        <w:rPr>
+          <w:rFonts w:eastAsia="Arial"/>
+          <w:b w:val="0"/>
+          <w:bCs/>
+          <w:sz w:val="22"/>
+          <w:szCs w:val="22"/>
+          <w:lang w:val="en-GB"/>
+        </w:rPr>
+        <w:t xml:space="preserve"> </w:t>
+      </w:r>
+      <w:r>
+        <w:rPr>
+          <w:rFonts w:eastAsia="Arial"/>
+          <w:b w:val="0"/>
+          <w:bCs/>
+          <w:sz w:val="22"/>
+          <w:szCs w:val="22"/>
+          <w:lang w:val="en-GB"/>
+        </w:rPr>
+        <w:t>9</w:t>
+      </w:r>
+      <w:r>
+        <w:rPr>
+          <w:rFonts w:eastAsia="Arial"/>
+          <w:b w:val="0"/>
+          <w:bCs/>
+          <w:sz w:val="22"/>
+          <w:szCs w:val="22"/>
+          <w:lang w:val="en-GB"/>
+        </w:rPr>
+        <w:t>, 2026</w:t>
       </w:r>
     </w:p>
     <w:p>
@@ -1498,13 +1564,7 @@
           <w:rPr>
             <w:rFonts w:ascii="Cambria Math" w:hAnsi="Cambria Math"/>
           </w:rPr>
-          <m:t>=2</m:t>
-        </m:r>
-        <m:r>
-          <w:rPr>
-            <w:rFonts w:ascii="Cambria Math" w:hAnsi="Cambria Math"/>
-          </w:rPr>
-          <m:t>6</m:t>
+          <m:t>=26</m:t>
         </m:r>
       </m:oMath>
       <w:r>
@@ -1660,25 +1720,7 @@
             <w:rPr>
               <w:rFonts w:ascii="Cambria Math" w:hAnsi="Cambria Math"/>
             </w:rPr>
-            <m:t>6</m:t>
-          </m:r>
-          <m:r>
-            <w:rPr>
-              <w:rFonts w:ascii="Cambria Math" w:hAnsi="Cambria Math"/>
-            </w:rPr>
-            <m:t>= 7</m:t>
-          </m:r>
-          <m:r>
-            <w:rPr>
-              <w:rFonts w:ascii="Cambria Math" w:hAnsi="Cambria Math"/>
-            </w:rPr>
-            <m:t>5</m:t>
-          </m:r>
-          <m:r>
-            <w:rPr>
-              <w:rFonts w:ascii="Cambria Math" w:hAnsi="Cambria Math"/>
-            </w:rPr>
-            <m:t>.5825</m:t>
+            <m:t>6= 75.5825</m:t>
           </m:r>
         </m:oMath>
       </m:oMathPara>
@@ -1880,14 +1922,6 @@
         </w:rPr>
         <w:t xml:space="preserve"> plan of the topics we intend to cover.</w:t>
       </w:r>
-    </w:p>
-    <w:p>
-      <w:pPr>
-        <w:rPr>
-          <w:rFonts w:eastAsia="Arial"/>
-          <w:lang w:val="en-GB"/>
-        </w:rPr>
-      </w:pPr>
     </w:p>
     <w:tbl>
       <w:tblPr>
@@ -2334,6 +2368,130 @@
               </w:rPr>
               <w:t>Sheldon Axler</w:t>
             </w:r>
+            <w:r>
+              <w:rPr>
+                <w:rFonts w:eastAsia="Arial"/>
+                <w:b w:val="0"/>
+                <w:bCs w:val="0"/>
+                <w:lang w:val="en-GB"/>
+              </w:rPr>
+              <w:t xml:space="preserve"> </w:t>
+            </w:r>
+            <w:r>
+              <w:rPr>
+                <w:rFonts w:eastAsia="Arial"/>
+                <w:b w:val="0"/>
+                <w:bCs w:val="0"/>
+                <w:lang w:val="en-GB"/>
+              </w:rPr>
+              <w:br/>
+              <w:t>(</w:t>
+            </w:r>
+            <w:r>
+              <w:rPr>
+                <w:rFonts w:eastAsia="Arial"/>
+                <w:lang w:val="en-GB"/>
+              </w:rPr>
+              <w:t>3</w:t>
+            </w:r>
+            <w:r>
+              <w:rPr>
+                <w:rFonts w:eastAsia="Arial"/>
+                <w:vertAlign w:val="superscript"/>
+                <w:lang w:val="en-GB"/>
+              </w:rPr>
+              <w:t>rd</w:t>
+            </w:r>
+            <w:r>
+              <w:rPr>
+                <w:rFonts w:eastAsia="Arial"/>
+                <w:lang w:val="en-GB"/>
+              </w:rPr>
+              <w:t xml:space="preserve"> edition</w:t>
+            </w:r>
+            <w:r>
+              <w:rPr>
+                <w:rFonts w:eastAsia="Arial"/>
+                <w:b w:val="0"/>
+                <w:bCs w:val="0"/>
+                <w:lang w:val="en-GB"/>
+              </w:rPr>
+              <w:t xml:space="preserve"> </w:t>
+            </w:r>
+            <w:r>
+              <w:rPr>
+                <w:rFonts w:eastAsia="Arial"/>
+                <w:b w:val="0"/>
+                <w:bCs w:val="0"/>
+                <w:lang w:val="en-GB"/>
+              </w:rPr>
+              <w:br/>
+            </w:r>
+            <w:r>
+              <w:rPr>
+                <w:rFonts w:eastAsia="Arial"/>
+                <w:b w:val="0"/>
+                <w:bCs w:val="0"/>
+                <w:i/>
+                <w:iCs/>
+                <w:lang w:val="en-GB"/>
+              </w:rPr>
+              <w:t>not</w:t>
+            </w:r>
+            <w:r>
+              <w:rPr>
+                <w:rFonts w:eastAsia="Arial"/>
+                <w:b w:val="0"/>
+                <w:bCs w:val="0"/>
+                <w:i/>
+                <w:iCs/>
+                <w:lang w:val="en-GB"/>
+              </w:rPr>
+              <w:t xml:space="preserve"> the</w:t>
+            </w:r>
+            <w:r>
+              <w:rPr>
+                <w:rFonts w:eastAsia="Arial"/>
+                <w:b w:val="0"/>
+                <w:bCs w:val="0"/>
+                <w:i/>
+                <w:iCs/>
+                <w:lang w:val="en-GB"/>
+              </w:rPr>
+              <w:t xml:space="preserve"> 4</w:t>
+            </w:r>
+            <w:r>
+              <w:rPr>
+                <w:rFonts w:eastAsia="Arial"/>
+                <w:b w:val="0"/>
+                <w:bCs w:val="0"/>
+                <w:i/>
+                <w:iCs/>
+                <w:vertAlign w:val="superscript"/>
+                <w:lang w:val="en-GB"/>
+              </w:rPr>
+              <w:t>th</w:t>
+            </w:r>
+            <w:r>
+              <w:rPr>
+                <w:rFonts w:eastAsia="Arial"/>
+                <w:b w:val="0"/>
+                <w:bCs w:val="0"/>
+                <w:i/>
+                <w:iCs/>
+                <w:lang w:val="en-GB"/>
+              </w:rPr>
+              <w:t xml:space="preserve"> edition</w:t>
+            </w:r>
+            <w:r>
+              <w:rPr>
+                <w:rFonts w:eastAsia="Arial"/>
+                <w:b w:val="0"/>
+                <w:bCs w:val="0"/>
+                <w:lang w:val="en-GB"/>
+              </w:rPr>
+              <w:t>)</w:t>
+            </w:r>
           </w:p>
         </w:tc>
         <w:tc>
@@ -2355,7 +2513,35 @@
                 <w:rFonts w:eastAsia="Arial"/>
                 <w:lang w:val="en-GB"/>
               </w:rPr>
-              <w:t>Ch 5 (5A, 5C, 5D, 5E)</w:t>
+              <w:t>Ch 5 (5A, 5</w:t>
+            </w:r>
+            <w:r>
+              <w:rPr>
+                <w:rFonts w:eastAsia="Arial"/>
+                <w:lang w:val="en-GB"/>
+              </w:rPr>
+              <w:t>B</w:t>
+            </w:r>
+            <w:r>
+              <w:rPr>
+                <w:rFonts w:eastAsia="Arial"/>
+                <w:lang w:val="en-GB"/>
+              </w:rPr>
+              <w:t>, 5</w:t>
+            </w:r>
+            <w:r>
+              <w:rPr>
+                <w:rFonts w:eastAsia="Arial"/>
+                <w:lang w:val="en-GB"/>
+              </w:rPr>
+              <w:t>C</w:t>
+            </w:r>
+            <w:r>
+              <w:rPr>
+                <w:rFonts w:eastAsia="Arial"/>
+                <w:lang w:val="en-GB"/>
+              </w:rPr>
+              <w:t>)</w:t>
             </w:r>
           </w:p>
         </w:tc>
@@ -2424,7 +2610,7 @@
                 <w:rFonts w:eastAsia="Arial"/>
                 <w:lang w:val="en-GB"/>
               </w:rPr>
-              <w:t>Ch 6 (6A, 6B, pseudo-inverse*)</w:t>
+              <w:t>Ch 6 (6A, 6B)</w:t>
             </w:r>
           </w:p>
         </w:tc>
@@ -2490,7 +2676,21 @@
                 <w:rFonts w:eastAsia="Arial"/>
                 <w:lang w:val="en-GB"/>
               </w:rPr>
-              <w:t>Ch 7 (7A-E, F*)</w:t>
+              <w:t>Ch 7 (7A</w:t>
+            </w:r>
+            <w:r>
+              <w:rPr>
+                <w:rFonts w:eastAsia="Arial"/>
+                <w:lang w:val="en-GB"/>
+              </w:rPr>
+              <w:t>, 7B, 7C, 7D</w:t>
+            </w:r>
+            <w:r>
+              <w:rPr>
+                <w:rFonts w:eastAsia="Arial"/>
+                <w:lang w:val="en-GB"/>
+              </w:rPr>
+              <w:t>)</w:t>
             </w:r>
           </w:p>
         </w:tc>
@@ -2533,11 +2733,53 @@
               <w:spacing w:before="100" w:after="100"/>
               <w:rPr>
                 <w:rFonts w:eastAsia="Arial"/>
+                <w:lang w:val="en-GB"/>
+              </w:rPr>
+            </w:pPr>
+            <w:r>
+              <w:rPr>
+                <w:rFonts w:eastAsia="Arial"/>
                 <w:b w:val="0"/>
                 <w:bCs w:val="0"/>
                 <w:lang w:val="en-GB"/>
               </w:rPr>
-            </w:pPr>
+              <w:t xml:space="preserve">Gilbert Strang </w:t>
+            </w:r>
+            <w:r>
+              <w:rPr>
+                <w:rFonts w:eastAsia="Arial"/>
+                <w:lang w:val="en-GB"/>
+              </w:rPr>
+              <w:br/>
+            </w:r>
+            <w:r>
+              <w:rPr>
+                <w:rFonts w:eastAsia="Arial"/>
+                <w:b w:val="0"/>
+                <w:bCs w:val="0"/>
+                <w:lang w:val="en-GB"/>
+              </w:rPr>
+              <w:t>(4</w:t>
+            </w:r>
+            <w:r>
+              <w:rPr>
+                <w:rFonts w:eastAsia="Arial"/>
+                <w:b w:val="0"/>
+                <w:bCs w:val="0"/>
+                <w:vertAlign w:val="superscript"/>
+                <w:lang w:val="en-GB"/>
+              </w:rPr>
+              <w:t>th</w:t>
+            </w:r>
+            <w:r>
+              <w:rPr>
+                <w:rFonts w:eastAsia="Arial"/>
+                <w:b w:val="0"/>
+                <w:bCs w:val="0"/>
+                <w:lang w:val="en-GB"/>
+              </w:rPr>
+              <w:t xml:space="preserve"> edition)</w:t>
+            </w:r>
           </w:p>
         </w:tc>
         <w:tc>
@@ -2559,7 +2801,14 @@
                 <w:rFonts w:eastAsia="Arial"/>
                 <w:lang w:val="en-GB"/>
               </w:rPr>
-              <w:t>Ch 9C (Determinant)</w:t>
+              <w:t>Ch 4</w:t>
+            </w:r>
+            <w:r>
+              <w:rPr>
+                <w:rFonts w:eastAsia="Arial"/>
+                <w:lang w:val="en-GB"/>
+              </w:rPr>
+              <w:t xml:space="preserve"> (Determinant)</w:t>
             </w:r>
           </w:p>
         </w:tc>
@@ -2582,7 +2831,7 @@
                 <w:rFonts w:eastAsia="Arial"/>
                 <w:lang w:val="en-GB"/>
               </w:rPr>
-              <w:t>2</w:t>
+              <w:t>1</w:t>
             </w:r>
           </w:p>
         </w:tc>
@@ -2593,26 +2842,6 @@
         <w:rPr>
           <w:rFonts w:eastAsia="Arial"/>
           <w:lang w:val="en-GB"/>
-        </w:rPr>
-      </w:pPr>
-    </w:p>
-    <w:p>
-      <w:pPr>
-        <w:pStyle w:val="Normal0"/>
-        <w:pBdr>
-          <w:top w:val="nil"/>
-          <w:left w:val="nil"/>
-          <w:bottom w:val="nil"/>
-          <w:right w:val="nil"/>
-          <w:between w:val="nil"/>
-        </w:pBdr>
-        <w:ind w:firstLine="720"/>
-        <w:rPr>
-          <w:rFonts w:ascii="Arial" w:eastAsia="Arial" w:hAnsi="Arial" w:cs="Arial"/>
-          <w:bCs/>
-          <w:color w:val="000000"/>
-          <w:sz w:val="20"/>
-          <w:szCs w:val="20"/>
         </w:rPr>
       </w:pPr>
     </w:p>
@@ -2717,29 +2946,50 @@
         </w:rPr>
         <w:t>Linear Algebra Done Right.</w:t>
       </w:r>
-    </w:p>
-    <w:p>
-      <w:pPr>
-        <w:rPr>
-          <w:rFonts w:eastAsia="Arial"/>
-          <w:lang w:val="de-DE"/>
-        </w:rPr>
-      </w:pPr>
-      <w:r>
-        <w:rPr>
-          <w:rFonts w:eastAsia="Arial"/>
-          <w:lang w:val="de-DE"/>
-        </w:rPr>
-        <w:t xml:space="preserve">Kenneth Hoffman &amp; Ray Kunze. </w:t>
-      </w:r>
-      <w:r>
+      <w:r>
+        <w:rPr>
+          <w:rFonts w:eastAsia="Arial"/>
+          <w:i/>
+          <w:iCs/>
+          <w:lang w:val="en-GB"/>
+        </w:rPr>
+        <w:t xml:space="preserve"> (3</w:t>
+      </w:r>
+      <w:r>
+        <w:rPr>
+          <w:rFonts w:eastAsia="Arial"/>
+          <w:i/>
+          <w:iCs/>
+          <w:vertAlign w:val="superscript"/>
+          <w:lang w:val="en-GB"/>
+        </w:rPr>
+        <w:t>rd</w:t>
+      </w:r>
+      <w:r>
+        <w:rPr>
+          <w:rFonts w:eastAsia="Arial"/>
+          <w:i/>
+          <w:iCs/>
+          <w:lang w:val="en-GB"/>
+        </w:rPr>
+        <w:t xml:space="preserve"> edition)</w:t>
+      </w:r>
+    </w:p>
+    <w:p>
+      <w:pPr>
         <w:rPr>
           <w:rFonts w:eastAsia="Arial"/>
           <w:i/>
           <w:iCs/>
           <w:lang w:val="de-DE"/>
         </w:rPr>
-        <w:t>Linear Algebra</w:t>
+      </w:pPr>
+      <w:r>
+        <w:rPr>
+          <w:rFonts w:eastAsia="Arial"/>
+          <w:lang w:val="de-DE"/>
+        </w:rPr>
+        <w:t xml:space="preserve">Kenneth Hoffman &amp; Ray Kunze. </w:t>
       </w:r>
       <w:r>
         <w:rPr>
@@ -2748,21 +2998,127 @@
           <w:iCs/>
           <w:lang w:val="de-DE"/>
         </w:rPr>
+        <w:t>Linear Algebra</w:t>
+      </w:r>
+      <w:r>
+        <w:rPr>
+          <w:rFonts w:eastAsia="Arial"/>
+          <w:i/>
+          <w:iCs/>
+          <w:lang w:val="de-DE"/>
+        </w:rPr>
         <w:t>.</w:t>
       </w:r>
-    </w:p>
-    <w:p>
-      <w:pPr>
-        <w:pStyle w:val="Normal0"/>
-        <w:ind w:left="720" w:hanging="720"/>
-        <w:rPr>
-          <w:rFonts w:ascii="Arial" w:eastAsia="Arial" w:hAnsi="Arial" w:cs="Arial"/>
-          <w:b/>
-          <w:sz w:val="20"/>
-          <w:szCs w:val="20"/>
+      <w:r>
+        <w:rPr>
+          <w:rFonts w:eastAsia="Arial"/>
+          <w:i/>
+          <w:iCs/>
           <w:lang w:val="de-DE"/>
         </w:rPr>
-      </w:pPr>
+        <w:t xml:space="preserve"> (</w:t>
+      </w:r>
+      <w:r>
+        <w:rPr>
+          <w:rFonts w:eastAsia="Arial"/>
+          <w:i/>
+          <w:iCs/>
+          <w:lang w:val="en-GB"/>
+        </w:rPr>
+        <w:t>2</w:t>
+      </w:r>
+      <w:r>
+        <w:rPr>
+          <w:rFonts w:eastAsia="Arial"/>
+          <w:i/>
+          <w:iCs/>
+          <w:vertAlign w:val="superscript"/>
+          <w:lang w:val="en-GB"/>
+        </w:rPr>
+        <w:t>nd</w:t>
+      </w:r>
+      <w:r>
+        <w:rPr>
+          <w:rFonts w:eastAsia="Arial"/>
+          <w:i/>
+          <w:iCs/>
+          <w:lang w:val="de-DE"/>
+        </w:rPr>
+        <w:t xml:space="preserve"> </w:t>
+      </w:r>
+      <w:proofErr w:type="spellStart"/>
+      <w:r>
+        <w:rPr>
+          <w:rFonts w:eastAsia="Arial"/>
+          <w:i/>
+          <w:iCs/>
+          <w:lang w:val="de-DE"/>
+        </w:rPr>
+        <w:t>edition</w:t>
+      </w:r>
+      <w:proofErr w:type="spellEnd"/>
+      <w:r>
+        <w:rPr>
+          <w:rFonts w:eastAsia="Arial"/>
+          <w:i/>
+          <w:iCs/>
+          <w:lang w:val="de-DE"/>
+        </w:rPr>
+        <w:t xml:space="preserve">) </w:t>
+      </w:r>
+      <w:r>
+        <w:rPr>
+          <w:rFonts w:eastAsia="Arial"/>
+          <w:i/>
+          <w:iCs/>
+          <w:lang w:val="de-DE"/>
+        </w:rPr>
+        <w:br/>
+      </w:r>
+      <w:r>
+        <w:rPr>
+          <w:rFonts w:eastAsia="Arial"/>
+          <w:lang w:val="en-GB"/>
+        </w:rPr>
+        <w:t xml:space="preserve">Gilbert Strang. </w:t>
+      </w:r>
+      <w:r>
+        <w:rPr>
+          <w:rFonts w:eastAsia="Arial"/>
+          <w:i/>
+          <w:iCs/>
+          <w:lang w:val="en-GB"/>
+        </w:rPr>
+        <w:t xml:space="preserve">Linear Algebra and Its Applications. </w:t>
+      </w:r>
+      <w:r>
+        <w:rPr>
+          <w:rFonts w:eastAsia="Arial"/>
+          <w:i/>
+          <w:iCs/>
+          <w:lang w:val="en-GB"/>
+        </w:rPr>
+        <w:t>(4</w:t>
+      </w:r>
+      <w:r>
+        <w:rPr>
+          <w:rFonts w:eastAsia="Arial"/>
+          <w:i/>
+          <w:iCs/>
+          <w:vertAlign w:val="superscript"/>
+          <w:lang w:val="en-GB"/>
+        </w:rPr>
+        <w:t>th</w:t>
+      </w:r>
+      <w:r>
+        <w:rPr>
+          <w:rFonts w:eastAsia="Arial"/>
+          <w:i/>
+          <w:iCs/>
+          <w:lang w:val="en-GB"/>
+        </w:rPr>
+        <w:t xml:space="preserve"> edition)</w:t>
+      </w:r>
     </w:p>
     <w:p>
       <w:pPr>
@@ -5064,28 +5420,28 @@
 </file>
 
 <file path=customXml/item1.xml><?xml version="1.0" encoding="utf-8"?>
+<b:Sources xmlns:b="http://schemas.openxmlformats.org/officeDocument/2006/bibliography" xmlns="http://schemas.openxmlformats.org/officeDocument/2006/bibliography" SelectedStyle="/APASixthEditionOfficeOnline.xsl" StyleName="APA" Version="6"/>
+</file>
+
+<file path=customXml/item2.xml><?xml version="1.0" encoding="utf-8"?>
 <go:gDocsCustomXmlDataStorage xmlns:go="http://customooxmlschemas.google.com/" xmlns:r="http://schemas.openxmlformats.org/officeDocument/2006/relationships">
   <go:docsCustomData xmlns:go="http://customooxmlschemas.google.com/" roundtripDataSignature="AMtx7mjTYI4jtZMvJTWzVFSA37m48TEUWQ==">AMUW2mVmO3HiPDCzk96/JoPah+GQYMmTaZfxDgE5sP6lxNhoNn+TIjd5S375pooMBI3hcsfQNEZv8LRi0XSHZPp1TndSDOr9XI5dhyNKX5BvvQyfk8g8O1k=</go:docsCustomData>
 </go:gDocsCustomXmlDataStorage>
 </file>
 
-<file path=customXml/item2.xml><?xml version="1.0" encoding="utf-8"?>
-<b:Sources xmlns:b="http://schemas.openxmlformats.org/officeDocument/2006/bibliography" xmlns="http://schemas.openxmlformats.org/officeDocument/2006/bibliography" SelectedStyle="/APASixthEditionOfficeOnline.xsl" StyleName="APA" Version="6"/>
+<file path=customXml/itemProps1.xml><?xml version="1.0" encoding="utf-8"?>
+<ds:datastoreItem xmlns:ds="http://schemas.openxmlformats.org/officeDocument/2006/customXml" ds:itemID="{77AD3D1A-029C-914A-850E-9F8553F6CA0E}">
+  <ds:schemaRefs>
+    <ds:schemaRef ds:uri="http://schemas.openxmlformats.org/officeDocument/2006/bibliography"/>
+  </ds:schemaRefs>
+</ds:datastoreItem>
 </file>
 
-<file path=customXml/itemProps1.xml><?xml version="1.0" encoding="utf-8"?>
+<file path=customXml/itemProps2.xml><?xml version="1.0" encoding="utf-8"?>
 <ds:datastoreItem xmlns:ds="http://schemas.openxmlformats.org/officeDocument/2006/customXml" ds:itemID="{11111111-1234-1234-1234-123412341234}">
   <ds:schemaRefs>
     <ds:schemaRef ds:uri="http://customooxmlschemas.google.com/"/>
     <ds:schemaRef ds:uri="http://schemas.openxmlformats.org/officeDocument/2006/relationships"/>
   </ds:schemaRefs>
 </ds:datastoreItem>
-</file>
-
-<file path=customXml/itemProps2.xml><?xml version="1.0" encoding="utf-8"?>
-<ds:datastoreItem xmlns:ds="http://schemas.openxmlformats.org/officeDocument/2006/customXml" ds:itemID="{77AD3D1A-029C-914A-850E-9F8553F6CA0E}">
-  <ds:schemaRefs>
-    <ds:schemaRef ds:uri="http://schemas.openxmlformats.org/officeDocument/2006/bibliography"/>
-  </ds:schemaRefs>
-</ds:datastoreItem>
 </file>
</xml_diff>